<commit_message>
test and move templates to baseapp
</commit_message>
<xml_diff>
--- a/src/Apps/W1/PaymentPractices/App/src/Reports/Payment Practice Small BusinessBody.docx
+++ b/src/Apps/W1/PaymentPractices/App/src/Reports/Payment Practice Small BusinessBody.docx
@@ -3336,6 +3336,8 @@
  
              < R e p o r t N a m e > R e p o r t   N a m e < / R e p o r t N a m e >   
+             < R e p o r t C a p t i o n > R e p o r t   C a p t i o n < / R e p o r t C a p t i o n > + 
              < A b o u t T h i s R e p o r t T i t l e > A b o u t   T h i s   R e p o r t   T i t l e < / A b o u t T h i s R e p o r t T i t l e >   
              < A b o u t T h i s R e p o r t T e x t > A b o u t   T h i s   R e p o r t   T e x t < / A b o u t T h i s R e p o r t T e x t > @@ -3390,21 +3392,21 @@
  
              < C o m p a n y A d d r e s s L i n e s >   
-                 < C o m p a n y A d d r e s s L i n e > C o m p a n y   A d d r e s s   L i n e   1 < / C o m p a n y A d d r e s s L i n e > - 
-                 < C o m p a n y A d d r e s s L i n e > C o m p a n y   A d d r e s s   L i n e   2 < / C o m p a n y A d d r e s s L i n e > - 
-                 < C o m p a n y A d d r e s s L i n e > C o m p a n y   A d d r e s s   L i n e   3 < / C o m p a n y A d d r e s s L i n e > - 
-                 < C o m p a n y A d d r e s s L i n e > C o m p a n y   A d d r e s s   L i n e   4 < / C o m p a n y A d d r e s s L i n e > - 
-                 < C o m p a n y A d d r e s s L i n e > C o m p a n y   A d d r e s s   L i n e   5 < / C o m p a n y A d d r e s s L i n e > - 
-                 < C o m p a n y A d d r e s s L i n e > C o m p a n y   A d d r e s s   L i n e   6 < / C o m p a n y A d d r e s s L i n e > - 
-                 < C o m p a n y A d d r e s s L i n e > C o m p a n y   A d d r e s s   L i n e   7 < / C o m p a n y A d d r e s s L i n e > - 
-                 < C o m p a n y A d d r e s s L i n e > C o m p a n y   A d d r e s s   L i n e   8 < / C o m p a n y A d d r e s s L i n e > +                 < C o m p a n y A d d r e s s L i n e 1 > C o m p a n y   A d d r e s s   L i n e   1 < / C o m p a n y A d d r e s s L i n e 1 > + 
+                 < C o m p a n y A d d r e s s L i n e 2 > C o m p a n y   A d d r e s s   L i n e   2 < / C o m p a n y A d d r e s s L i n e 2 > + 
+                 < C o m p a n y A d d r e s s L i n e 3 > C o m p a n y   A d d r e s s   L i n e   3 < / C o m p a n y A d d r e s s L i n e 3 > + 
+                 < C o m p a n y A d d r e s s L i n e 4 > C o m p a n y   A d d r e s s   L i n e   4 < / C o m p a n y A d d r e s s L i n e 4 > + 
+                 < C o m p a n y A d d r e s s L i n e 5 > C o m p a n y   A d d r e s s   L i n e   5 < / C o m p a n y A d d r e s s L i n e 5 > + 
+                 < C o m p a n y A d d r e s s L i n e 6 > C o m p a n y   A d d r e s s   L i n e   6 < / C o m p a n y A d d r e s s L i n e 6 > + 
+                 < C o m p a n y A d d r e s s L i n e 7 > C o m p a n y   A d d r e s s   L i n e   7 < / C o m p a n y A d d r e s s L i n e 7 > + 
+                 < C o m p a n y A d d r e s s L i n e 8 > C o m p a n y   A d d r e s s   L i n e   8 < / C o m p a n y A d d r e s s L i n e 8 >   
              < / C o m p a n y A d d r e s s L i n e s >   
@@ -3593,6 +3595,8 @@
  
              < R e p o r t N a m e > R e p o r t   N a m e < / R e p o r t N a m e >   
+             < R e p o r t C a p t i o n > R e p o r t   C a p t i o n < / R e p o r t C a p t i o n > + 
              < A b o u t T h i s R e p o r t T i t l e > A b o u t   T h i s   R e p o r t   T i t l e < / A b o u t T h i s R e p o r t T i t l e >   
              < A b o u t T h i s R e p o r t T e x t > A b o u t   T h i s   R e p o r t   T e x t < / A b o u t T h i s R e p o r t T e x t > @@ -3647,21 +3651,21 @@
  
              < C o m p a n y A d d r e s s L i n e s >   
-                 < C o m p a n y A d d r e s s L i n e > C o m p a n y   A d d r e s s   L i n e   1 < / C o m p a n y A d d r e s s L i n e > - 
-                 < C o m p a n y A d d r e s s L i n e > C o m p a n y   A d d r e s s   L i n e   2 < / C o m p a n y A d d r e s s L i n e > - 
-                 < C o m p a n y A d d r e s s L i n e > C o m p a n y   A d d r e s s   L i n e   3 < / C o m p a n y A d d r e s s L i n e > - 
-                 < C o m p a n y A d d r e s s L i n e > C o m p a n y   A d d r e s s   L i n e   4 < / C o m p a n y A d d r e s s L i n e > - 
-                 < C o m p a n y A d d r e s s L i n e > C o m p a n y   A d d r e s s   L i n e   5 < / C o m p a n y A d d r e s s L i n e > - 
-                 < C o m p a n y A d d r e s s L i n e > C o m p a n y   A d d r e s s   L i n e   6 < / C o m p a n y A d d r e s s L i n e > - 
-                 < C o m p a n y A d d r e s s L i n e > C o m p a n y   A d d r e s s   L i n e   7 < / C o m p a n y A d d r e s s L i n e > - 
-                 < C o m p a n y A d d r e s s L i n e > C o m p a n y   A d d r e s s   L i n e   8 < / C o m p a n y A d d r e s s L i n e > +                 < C o m p a n y A d d r e s s L i n e 1 > C o m p a n y   A d d r e s s   L i n e   1 < / C o m p a n y A d d r e s s L i n e 1 > + 
+                 < C o m p a n y A d d r e s s L i n e 2 > C o m p a n y   A d d r e s s   L i n e   2 < / C o m p a n y A d d r e s s L i n e 2 > + 
+                 < C o m p a n y A d d r e s s L i n e 3 > C o m p a n y   A d d r e s s   L i n e   3 < / C o m p a n y A d d r e s s L i n e 3 > + 
+                 < C o m p a n y A d d r e s s L i n e 4 > C o m p a n y   A d d r e s s   L i n e   4 < / C o m p a n y A d d r e s s L i n e 4 > + 
+                 < C o m p a n y A d d r e s s L i n e 5 > C o m p a n y   A d d r e s s   L i n e   5 < / C o m p a n y A d d r e s s L i n e 5 > + 
+                 < C o m p a n y A d d r e s s L i n e 6 > C o m p a n y   A d d r e s s   L i n e   6 < / C o m p a n y A d d r e s s L i n e 6 > + 
+                 < C o m p a n y A d d r e s s L i n e 7 > C o m p a n y   A d d r e s s   L i n e   7 < / C o m p a n y A d d r e s s L i n e 7 > + 
+                 < C o m p a n y A d d r e s s L i n e 8 > C o m p a n y   A d d r e s s   L i n e   8 < / C o m p a n y A d d r e s s L i n e 8 >   
              < / C o m p a n y A d d r e s s L i n e s >   

</xml_diff>